<commit_message>
fixed web presentation errors
</commit_message>
<xml_diff>
--- a/SoutheyLetters/For SOUTHEY MANUAL.docx
+++ b/SoutheyLetters/For SOUTHEY MANUAL.docx
@@ -9,6 +9,38 @@
     </w:p>
     <w:p/>
     <w:p>
+      <w:r>
+        <w:rPr>
+          <w:b/>
+          <w:bCs/>
+        </w:rPr>
+        <w:t>Letter IDs</w:t>
+      </w:r>
+      <w:r>
+        <w:t>: The new system for creating letter ids is “</w:t>
+      </w:r>
+      <w:proofErr w:type="spellStart"/>
+      <w:r>
+        <w:t>southey</w:t>
+      </w:r>
+      <w:proofErr w:type="spellEnd"/>
+      <w:r>
+        <w:t xml:space="preserve">” dot [Part # in number form, 8 </w:t>
+      </w:r>
+      <w:proofErr w:type="spellStart"/>
+      <w:r>
+        <w:t>eg</w:t>
+      </w:r>
+      <w:proofErr w:type="spellEnd"/>
+      <w:r>
+        <w:t>] dot [letter number] no spaces</w:t>
+      </w:r>
+      <w:r>
+        <w:t xml:space="preserve">. Example: southey.6.3233 </w:t>
+      </w:r>
+    </w:p>
+    <w:p/>
+    <w:p>
       <w:pPr>
         <w:rPr>
           <w:color w:val="000000" w:themeColor="text1"/>
@@ -587,6 +619,7 @@
         <w:ind w:left="720"/>
       </w:pPr>
       <w:r>
+        <w:lastRenderedPageBreak/>
         <w:tab/>
       </w:r>
       <w:r>
@@ -988,112 +1021,91 @@
         <w:t>&gt;</w:t>
       </w:r>
       <w:r>
-        <w:t xml:space="preserve"> or </w:t>
-      </w:r>
-      <w:r>
-        <w:t>&lt;death</w:t>
-      </w:r>
+        <w:t xml:space="preserve"> or &lt;death&gt;1825&lt;/death&gt;</w:t>
+      </w:r>
+    </w:p>
+    <w:p>
+      <w:r>
+        <w:tab/>
+        <w:t>&lt;floruit&gt;f. 1820-1830&lt;/floruit&gt;</w:t>
+      </w:r>
+    </w:p>
+    <w:p>
+      <w:pPr>
+        <w:ind w:left="1440"/>
+      </w:pPr>
+      <w:r>
+        <w:t xml:space="preserve">Can have birth, death, floruit, or none; can contain any symbols (b. </w:t>
+      </w:r>
+      <w:proofErr w:type="gramStart"/>
+      <w:r>
+        <w:t>d. ?</w:t>
+      </w:r>
+      <w:proofErr w:type="gramEnd"/>
+      <w:r>
+        <w:t xml:space="preserve"> etc.) but NO PARENTHESIS since these</w:t>
+      </w:r>
+      <w:r>
+        <w:t xml:space="preserve"> </w:t>
+      </w:r>
+      <w:r>
+        <w:t xml:space="preserve">are added </w:t>
+      </w:r>
+      <w:r>
+        <w:t xml:space="preserve">to the text when needed </w:t>
+      </w:r>
+      <w:r>
+        <w:t xml:space="preserve">by the </w:t>
+      </w:r>
+      <w:proofErr w:type="spellStart"/>
+      <w:r>
+        <w:lastRenderedPageBreak/>
+        <w:t>xslt</w:t>
+      </w:r>
+      <w:proofErr w:type="spellEnd"/>
+      <w:r>
+        <w:t xml:space="preserve">. If no dates, </w:t>
+      </w:r>
+      <w:proofErr w:type="spellStart"/>
+      <w:r>
+        <w:t>xslt</w:t>
+      </w:r>
+      <w:proofErr w:type="spellEnd"/>
+      <w:r>
+        <w:t xml:space="preserve"> will leave blank; if "(dates unknown)" put it at the end of the bio note.)</w:t>
+      </w:r>
+    </w:p>
+    <w:p>
+      <w:r>
+        <w:t xml:space="preserve">            &lt;</w:t>
+      </w:r>
+      <w:proofErr w:type="spellStart"/>
+      <w:r>
+        <w:t>bibl</w:t>
+      </w:r>
+      <w:proofErr w:type="spellEnd"/>
+      <w:r>
+        <w:t>&gt;&lt;title ref="#</w:t>
+      </w:r>
+      <w:proofErr w:type="spellStart"/>
+      <w:r>
+        <w:t>dnb</w:t>
+      </w:r>
+      <w:proofErr w:type="spellEnd"/>
+      <w:r>
+        <w:t>"&gt;DNB&lt;/title&gt;, &lt;title ref="#hp"&gt;Hist P&lt;/title&gt;&lt;/</w:t>
+      </w:r>
+      <w:proofErr w:type="spellStart"/>
+      <w:r>
+        <w:t>bibl</w:t>
+      </w:r>
+      <w:proofErr w:type="spellEnd"/>
       <w:r>
         <w:t>&gt;</w:t>
       </w:r>
-      <w:r>
-        <w:t>1825</w:t>
-      </w:r>
-      <w:r>
-        <w:t>&lt;</w:t>
-      </w:r>
-      <w:r>
-        <w:t>/</w:t>
-      </w:r>
-      <w:r>
-        <w:t>death</w:t>
-      </w:r>
-      <w:r>
-        <w:t>&gt;</w:t>
-      </w:r>
-    </w:p>
-    <w:p>
-      <w:r>
-        <w:tab/>
-        <w:t>&lt;floruit&gt;f. 1820-1830&lt;/floruit&gt;</w:t>
-      </w:r>
-    </w:p>
-    <w:p>
-      <w:pPr>
-        <w:ind w:left="1440"/>
-      </w:pPr>
-      <w:r>
-        <w:t xml:space="preserve">Can have birth, death, floruit, or none; can contain any symbols (b. </w:t>
-      </w:r>
-      <w:proofErr w:type="gramStart"/>
-      <w:r>
-        <w:t>d. ?</w:t>
-      </w:r>
-      <w:proofErr w:type="gramEnd"/>
-      <w:r>
-        <w:t xml:space="preserve"> etc.) but NO PARENTHESIS since these</w:t>
-      </w:r>
-      <w:r>
-        <w:t xml:space="preserve"> </w:t>
-      </w:r>
-      <w:r>
-        <w:t xml:space="preserve">are added </w:t>
-      </w:r>
-      <w:r>
-        <w:t xml:space="preserve">to the text when needed </w:t>
-      </w:r>
-      <w:r>
-        <w:t xml:space="preserve">by the </w:t>
-      </w:r>
-      <w:proofErr w:type="spellStart"/>
-      <w:r>
-        <w:t>xslt</w:t>
-      </w:r>
-      <w:proofErr w:type="spellEnd"/>
-      <w:r>
-        <w:t xml:space="preserve">. If no dates, </w:t>
-      </w:r>
-      <w:proofErr w:type="spellStart"/>
-      <w:r>
-        <w:t>xslt</w:t>
-      </w:r>
-      <w:proofErr w:type="spellEnd"/>
-      <w:r>
-        <w:t xml:space="preserve"> will leave blank; if "(dates unknown)" put it at the end of the bio note.)</w:t>
-      </w:r>
-    </w:p>
-    <w:p>
-      <w:r>
-        <w:t xml:space="preserve">            &lt;</w:t>
-      </w:r>
-      <w:proofErr w:type="spellStart"/>
-      <w:r>
-        <w:t>bibl</w:t>
-      </w:r>
-      <w:proofErr w:type="spellEnd"/>
-      <w:r>
-        <w:t>&gt;&lt;title ref="#</w:t>
-      </w:r>
-      <w:proofErr w:type="spellStart"/>
-      <w:r>
-        <w:t>dnb</w:t>
-      </w:r>
-      <w:proofErr w:type="spellEnd"/>
-      <w:r>
-        <w:t>"&gt;DNB&lt;/title&gt;, &lt;title ref="#hp"&gt;Hist P&lt;/title&gt;&lt;/</w:t>
-      </w:r>
-      <w:proofErr w:type="spellStart"/>
-      <w:r>
-        <w:t>bibl</w:t>
-      </w:r>
-      <w:proofErr w:type="spellEnd"/>
-      <w:r>
-        <w:t>&gt;</w:t>
-      </w:r>
-    </w:p>
-    <w:p>
-      <w:r>
-        <w:lastRenderedPageBreak/>
+    </w:p>
+    <w:p>
+      <w:r>
         <w:t xml:space="preserve">            &lt;note type="bio" target="#</w:t>
       </w:r>
       <w:proofErr w:type="spellStart"/>
@@ -1644,25 +1656,7 @@
           <w:kern w:val="0"/>
           <w:highlight w:val="white"/>
         </w:rPr>
-        <w:t>15,</w:t>
-      </w:r>
-      <w:r>
-        <w:rPr>
-          <w:rFonts w:ascii="Times New Roman" w:hAnsi="Times New Roman" w:cs="Times New Roman"/>
-          <w:color w:val="000000"/>
-          <w:kern w:val="0"/>
-          <w:highlight w:val="white"/>
-        </w:rPr>
-        <w:t xml:space="preserve"> </w:t>
-      </w:r>
-      <w:r>
-        <w:rPr>
-          <w:rFonts w:ascii="Times New Roman" w:hAnsi="Times New Roman" w:cs="Times New Roman"/>
-          <w:color w:val="000000"/>
-          <w:kern w:val="0"/>
-          <w:highlight w:val="white"/>
-        </w:rPr>
-        <w:t xml:space="preserve"> 2011</w:t>
+        <w:t>15,  2011</w:t>
       </w:r>
       <w:proofErr w:type="gramEnd"/>
       <w:r>
@@ -1728,6 +1722,7 @@
           <w:kern w:val="0"/>
           <w:highlight w:val="white"/>
         </w:rPr>
+        <w:lastRenderedPageBreak/>
         <w:t xml:space="preserve"> </w:t>
       </w:r>
       <w:r>
@@ -1755,22 +1750,21 @@
         <w:ind w:left="720"/>
       </w:pPr>
       <w:r>
-        <w:lastRenderedPageBreak/>
         <w:t>Because there is misnumbering of notes (duplicate n= “X” where X is a number) in the XML notes (I found many in Part Three when trying to transform them</w:t>
       </w:r>
       <w:r>
         <w:t>; with lots of notes, coder error is pretty difficult to avoid</w:t>
       </w:r>
       <w:r>
-        <w:t xml:space="preserve">), </w:t>
-      </w:r>
-      <w:proofErr w:type="spellStart"/>
-      <w:r>
-        <w:t xml:space="preserve">the </w:t>
-      </w:r>
-      <w:proofErr w:type="spellEnd"/>
-      <w:r>
-        <w:t xml:space="preserve">xslt ignores the note numbers that you give notes manually. </w:t>
+        <w:t xml:space="preserve">), the </w:t>
+      </w:r>
+      <w:proofErr w:type="spellStart"/>
+      <w:r>
+        <w:t>xslt</w:t>
+      </w:r>
+      <w:proofErr w:type="spellEnd"/>
+      <w:r>
+        <w:t xml:space="preserve"> ignores the note numbers that you give notes manually. </w:t>
       </w:r>
       <w:r>
         <w:t xml:space="preserve">Leaving notes unnumbered also allows moving them if need </w:t>

</xml_diff>

<commit_message>
generating lists of people mentioned and written to
</commit_message>
<xml_diff>
--- a/SoutheyLetters/For SOUTHEY MANUAL.docx
+++ b/SoutheyLetters/For SOUTHEY MANUAL.docx
@@ -41,6 +41,19 @@
     </w:p>
     <w:p/>
     <w:p>
+      <w:r>
+        <w:rPr>
+          <w:b/>
+          <w:bCs/>
+        </w:rPr>
+        <w:t>Dates</w:t>
+      </w:r>
+      <w:r>
+        <w:t>: make sure that all brackets for dates not written in the letters are place INSIDE the date tag. (I fixed southey.6.3486.1)</w:t>
+      </w:r>
+    </w:p>
+    <w:p/>
+    <w:p>
       <w:pPr>
         <w:rPr>
           <w:color w:val="000000" w:themeColor="text1"/>
@@ -550,6 +563,7 @@
         <w:ind w:left="720"/>
       </w:pPr>
       <w:r>
+        <w:lastRenderedPageBreak/>
         <w:tab/>
       </w:r>
       <w:r>
@@ -619,7 +633,6 @@
         <w:ind w:left="720"/>
       </w:pPr>
       <w:r>
-        <w:lastRenderedPageBreak/>
         <w:tab/>
       </w:r>
       <w:r>
@@ -1026,6 +1039,7 @@
     </w:p>
     <w:p>
       <w:r>
+        <w:lastRenderedPageBreak/>
         <w:tab/>
         <w:t>&lt;floruit&gt;f. 1820-1830&lt;/floruit&gt;</w:t>
       </w:r>
@@ -1059,7 +1073,6 @@
       </w:r>
       <w:proofErr w:type="spellStart"/>
       <w:r>
-        <w:lastRenderedPageBreak/>
         <w:t>xslt</w:t>
       </w:r>
       <w:proofErr w:type="spellEnd"/>
@@ -1583,6 +1596,7 @@
           <w:kern w:val="0"/>
           <w:highlight w:val="white"/>
         </w:rPr>
+        <w:lastRenderedPageBreak/>
         <w:t>&lt;p&gt;</w:t>
       </w:r>
       <w:r>
@@ -1722,7 +1736,6 @@
           <w:kern w:val="0"/>
           <w:highlight w:val="white"/>
         </w:rPr>
-        <w:lastRenderedPageBreak/>
         <w:t xml:space="preserve"> </w:t>
       </w:r>
       <w:r>

</xml_diff>

<commit_message>
fixing xml ref tags
</commit_message>
<xml_diff>
--- a/SoutheyLetters/For SOUTHEY MANUAL.docx
+++ b/SoutheyLetters/For SOUTHEY MANUAL.docx
@@ -11,6 +11,76 @@
     <w:p>
       <w:r>
         <w:rPr>
+          <w:color w:val="EE0000"/>
+        </w:rPr>
+        <w:t xml:space="preserve">! </w:t>
+      </w:r>
+      <w:proofErr w:type="gramStart"/>
+      <w:r>
+        <w:rPr>
+          <w:color w:val="EE0000"/>
+        </w:rPr>
+        <w:t>IMPORTANT !</w:t>
+      </w:r>
+      <w:proofErr w:type="gramEnd"/>
+      <w:r>
+        <w:rPr>
+          <w:color w:val="EE0000"/>
+        </w:rPr>
+        <w:t xml:space="preserve"> </w:t>
+      </w:r>
+      <w:r>
+        <w:rPr>
+          <w:color w:val="000000" w:themeColor="text1"/>
+        </w:rPr>
+        <w:t>no spaces after id in target tags</w:t>
+      </w:r>
+    </w:p>
+    <w:p/>
+    <w:p>
+      <w:r>
+        <w:t>target="</w:t>
+      </w:r>
+      <w:proofErr w:type="spellStart"/>
+      <w:r>
+        <w:t>people.html#HareJulius</w:t>
+      </w:r>
+      <w:proofErr w:type="spellEnd"/>
+      <w:r>
+        <w:t xml:space="preserve"> "</w:t>
+      </w:r>
+    </w:p>
+    <w:p/>
+    <w:p>
+      <w:r>
+        <w:t>needs to be</w:t>
+      </w:r>
+    </w:p>
+    <w:p/>
+    <w:p>
+      <w:r>
+        <w:t>target="</w:t>
+      </w:r>
+      <w:proofErr w:type="spellStart"/>
+      <w:r>
+        <w:t>people.html#HareJulius</w:t>
+      </w:r>
+      <w:proofErr w:type="spellEnd"/>
+      <w:r>
+        <w:t>"</w:t>
+      </w:r>
+    </w:p>
+    <w:p/>
+    <w:p>
+      <w:r>
+        <w:t>(The links to the people page work with the space in it, but it interferes with generating lists of all the letters written to him and all the letters in which he is mentioned.)</w:t>
+      </w:r>
+    </w:p>
+    <w:p/>
+    <w:p/>
+    <w:p>
+      <w:r>
+        <w:rPr>
           <w:b/>
           <w:bCs/>
         </w:rPr>
@@ -76,6 +146,95 @@
     </w:p>
     <w:p>
       <w:pPr>
+        <w:rPr>
+          <w:color w:val="000000" w:themeColor="text1"/>
+        </w:rPr>
+      </w:pPr>
+    </w:p>
+    <w:p>
+      <w:r>
+        <w:rPr>
+          <w:color w:val="EE0000"/>
+        </w:rPr>
+        <w:t xml:space="preserve">! </w:t>
+      </w:r>
+      <w:proofErr w:type="gramStart"/>
+      <w:r>
+        <w:rPr>
+          <w:color w:val="EE0000"/>
+        </w:rPr>
+        <w:t>IMPORTANT !</w:t>
+      </w:r>
+      <w:proofErr w:type="gramEnd"/>
+      <w:r>
+        <w:rPr>
+          <w:color w:val="EE0000"/>
+        </w:rPr>
+        <w:t xml:space="preserve"> </w:t>
+      </w:r>
+      <w:r>
+        <w:rPr>
+          <w:color w:val="000000" w:themeColor="text1"/>
+        </w:rPr>
+        <w:t>no spaces after id in target tags</w:t>
+      </w:r>
+    </w:p>
+    <w:p/>
+    <w:p>
+      <w:r>
+        <w:t>target="</w:t>
+      </w:r>
+      <w:proofErr w:type="spellStart"/>
+      <w:r>
+        <w:t>people.html#HareJulius</w:t>
+      </w:r>
+      <w:proofErr w:type="spellEnd"/>
+      <w:r>
+        <w:t xml:space="preserve"> </w:t>
+      </w:r>
+      <w:r>
+        <w:t xml:space="preserve">  </w:t>
+      </w:r>
+      <w:r>
+        <w:t>"</w:t>
+      </w:r>
+    </w:p>
+    <w:p/>
+    <w:p>
+      <w:r>
+        <w:t>needs to be</w:t>
+      </w:r>
+    </w:p>
+    <w:p/>
+    <w:p>
+      <w:r>
+        <w:t>target="</w:t>
+      </w:r>
+      <w:proofErr w:type="spellStart"/>
+      <w:r>
+        <w:t>people.html#HareJulius</w:t>
+      </w:r>
+      <w:proofErr w:type="spellEnd"/>
+      <w:r>
+        <w:t>"</w:t>
+      </w:r>
+    </w:p>
+    <w:p>
+      <w:pPr>
+        <w:rPr>
+          <w:color w:val="000000" w:themeColor="text1"/>
+        </w:rPr>
+      </w:pPr>
+    </w:p>
+    <w:p>
+      <w:pPr>
+        <w:rPr>
+          <w:color w:val="000000" w:themeColor="text1"/>
+        </w:rPr>
+      </w:pPr>
+    </w:p>
+    <w:p>
+      <w:pPr>
         <w:ind w:left="1440"/>
         <w:rPr>
           <w:color w:val="000000" w:themeColor="text1"/>
@@ -143,206 +302,227 @@
         <w:rPr>
           <w:color w:val="000000" w:themeColor="text1"/>
         </w:rPr>
-        <w:t xml:space="preserve"> in the letter – addressees are type</w:t>
-      </w:r>
-      <w:proofErr w:type="gramStart"/>
-      <w:r>
-        <w:rPr>
-          <w:color w:val="000000" w:themeColor="text1"/>
-        </w:rPr>
-        <w:t>=“</w:t>
-      </w:r>
-      <w:proofErr w:type="gramEnd"/>
-      <w:r>
-        <w:rPr>
-          <w:color w:val="000000" w:themeColor="text1"/>
-        </w:rPr>
-        <w:t>a”</w:t>
-      </w:r>
-      <w:r>
-        <w:rPr>
-          <w:color w:val="000000" w:themeColor="text1"/>
-        </w:rPr>
-        <w:t xml:space="preserve"> -</w:t>
-      </w:r>
-      <w:r>
-        <w:rPr>
-          <w:color w:val="000000" w:themeColor="text1"/>
-        </w:rPr>
-        <w:t xml:space="preserve">- </w:t>
-      </w:r>
-    </w:p>
-    <w:p>
-      <w:pPr>
-        <w:ind w:left="1440"/>
-        <w:rPr>
-          <w:color w:val="000000" w:themeColor="text1"/>
-        </w:rPr>
-      </w:pPr>
-    </w:p>
-    <w:p>
-      <w:pPr>
-        <w:ind w:left="1440"/>
-        <w:rPr>
-          <w:color w:val="000000" w:themeColor="text1"/>
-        </w:rPr>
-      </w:pPr>
-      <w:r>
-        <w:rPr>
-          <w:color w:val="000000" w:themeColor="text1"/>
-        </w:rPr>
-        <w:t>&lt;ref&gt;s for</w:t>
-      </w:r>
-      <w:r>
-        <w:rPr>
-          <w:color w:val="000000" w:themeColor="text1"/>
-        </w:rPr>
-        <w:t xml:space="preserve"> places </w:t>
-      </w:r>
-      <w:proofErr w:type="gramStart"/>
-      <w:r>
-        <w:rPr>
-          <w:color w:val="000000" w:themeColor="text1"/>
-        </w:rPr>
-        <w:t>have</w:t>
-      </w:r>
-      <w:proofErr w:type="gramEnd"/>
-      <w:r>
-        <w:rPr>
-          <w:color w:val="000000" w:themeColor="text1"/>
-        </w:rPr>
-        <w:t xml:space="preserve"> no type</w:t>
-      </w:r>
-      <w:r>
-        <w:rPr>
-          <w:color w:val="000000" w:themeColor="text1"/>
-        </w:rPr>
-        <w:t>: &lt;ref target</w:t>
-      </w:r>
-      <w:proofErr w:type="gramStart"/>
-      <w:r>
-        <w:rPr>
-          <w:color w:val="000000" w:themeColor="text1"/>
-        </w:rPr>
-        <w:t>=“</w:t>
-      </w:r>
-      <w:proofErr w:type="gramEnd"/>
-      <w:r>
-        <w:rPr>
-          <w:color w:val="000000" w:themeColor="text1"/>
-        </w:rPr>
-        <w:t>places.html#...”</w:t>
-      </w:r>
-    </w:p>
-    <w:p>
-      <w:r>
-        <w:t>(It looks like the mistake of including type</w:t>
-      </w:r>
-      <w:proofErr w:type="gramStart"/>
-      <w:r>
-        <w:t>=“</w:t>
-      </w:r>
-      <w:proofErr w:type="gramEnd"/>
-      <w:r>
-        <w:t>m” for place started with Part 6.)</w:t>
-      </w:r>
-    </w:p>
-    <w:p/>
-    <w:p>
+        <w:t xml:space="preserve"> in the letter – addressees are </w:t>
+      </w:r>
       <w:r>
         <w:rPr>
           <w:b/>
           <w:bCs/>
-        </w:rPr>
-        <w:t>Div Tags</w:t>
-      </w:r>
-      <w:r>
-        <w:t>:</w:t>
-      </w:r>
-    </w:p>
-    <w:p/>
-    <w:p>
-      <w:pPr>
-        <w:ind w:left="720"/>
-      </w:pPr>
-      <w:r>
-        <w:t xml:space="preserve">@type can be: </w:t>
-      </w:r>
-    </w:p>
-    <w:p>
-      <w:pPr>
-        <w:ind w:left="720"/>
-      </w:pPr>
-      <w:r>
-        <w:t>“</w:t>
-      </w:r>
-      <w:proofErr w:type="spellStart"/>
-      <w:r>
-        <w:t>paratext</w:t>
-      </w:r>
-      <w:proofErr w:type="spellEnd"/>
-      <w:r>
-        <w:t>” (accompanying materials written by Lynda – Chrono, letter lists, people, places)</w:t>
-      </w:r>
-    </w:p>
-    <w:p>
-      <w:pPr>
-        <w:ind w:left="720"/>
-      </w:pPr>
-      <w:r>
-        <w:t>“letter”</w:t>
-      </w:r>
-    </w:p>
-    <w:p>
-      <w:pPr>
-        <w:ind w:left="720"/>
-      </w:pPr>
-      <w:r>
-        <w:t>“introduction”</w:t>
-      </w:r>
-    </w:p>
-    <w:p>
-      <w:pPr>
-        <w:ind w:left="720"/>
-      </w:pPr>
-      <w:r>
-        <w:t>“appendix”</w:t>
-      </w:r>
-    </w:p>
-    <w:p>
-      <w:pPr>
+          <w:color w:val="000000" w:themeColor="text1"/>
+        </w:rPr>
+        <w:t>type</w:t>
+      </w:r>
+      <w:proofErr w:type="gramStart"/>
+      <w:r>
         <w:rPr>
           <w:b/>
           <w:bCs/>
-        </w:rPr>
-      </w:pPr>
-    </w:p>
-    <w:p>
+          <w:color w:val="000000" w:themeColor="text1"/>
+        </w:rPr>
+        <w:t>=“</w:t>
+      </w:r>
+      <w:proofErr w:type="gramEnd"/>
       <w:r>
         <w:rPr>
           <w:b/>
           <w:bCs/>
-        </w:rPr>
-        <w:t xml:space="preserve">Title: </w:t>
-      </w:r>
-      <w:r>
-        <w:t>Use &lt;title&gt; not &lt;term&gt;</w:t>
-      </w:r>
-    </w:p>
-    <w:p>
-      <w:pPr>
+          <w:color w:val="000000" w:themeColor="text1"/>
+        </w:rPr>
+        <w:t>a”</w:t>
+      </w:r>
+      <w:r>
+        <w:rPr>
+          <w:color w:val="000000" w:themeColor="text1"/>
+        </w:rPr>
+        <w:t xml:space="preserve"> -</w:t>
+      </w:r>
+      <w:r>
+        <w:rPr>
+          <w:color w:val="000000" w:themeColor="text1"/>
+        </w:rPr>
+        <w:t xml:space="preserve">- </w:t>
+      </w:r>
+    </w:p>
+    <w:p>
+      <w:pPr>
+        <w:ind w:left="1440"/>
+        <w:rPr>
+          <w:color w:val="000000" w:themeColor="text1"/>
+        </w:rPr>
+      </w:pPr>
+    </w:p>
+    <w:p>
+      <w:pPr>
+        <w:ind w:left="1440"/>
+        <w:rPr>
+          <w:color w:val="000000" w:themeColor="text1"/>
+        </w:rPr>
+      </w:pPr>
+      <w:r>
+        <w:rPr>
+          <w:color w:val="000000" w:themeColor="text1"/>
+        </w:rPr>
+        <w:t>&lt;ref&gt;s for</w:t>
+      </w:r>
+      <w:r>
+        <w:rPr>
+          <w:color w:val="000000" w:themeColor="text1"/>
+        </w:rPr>
+        <w:t xml:space="preserve"> places </w:t>
+      </w:r>
+      <w:proofErr w:type="gramStart"/>
+      <w:r>
+        <w:rPr>
+          <w:color w:val="000000" w:themeColor="text1"/>
+        </w:rPr>
+        <w:t>have</w:t>
+      </w:r>
+      <w:proofErr w:type="gramEnd"/>
+      <w:r>
+        <w:rPr>
+          <w:color w:val="000000" w:themeColor="text1"/>
+        </w:rPr>
+        <w:t xml:space="preserve"> no type</w:t>
+      </w:r>
+      <w:r>
+        <w:rPr>
+          <w:color w:val="000000" w:themeColor="text1"/>
+        </w:rPr>
+        <w:t>: &lt;ref target</w:t>
+      </w:r>
+      <w:proofErr w:type="gramStart"/>
+      <w:r>
+        <w:rPr>
+          <w:color w:val="000000" w:themeColor="text1"/>
+        </w:rPr>
+        <w:t>=“</w:t>
+      </w:r>
+      <w:proofErr w:type="gramEnd"/>
+      <w:r>
+        <w:rPr>
+          <w:color w:val="000000" w:themeColor="text1"/>
+        </w:rPr>
+        <w:t>places.html#...”</w:t>
+      </w:r>
+    </w:p>
+    <w:p>
+      <w:pPr>
+        <w:ind w:left="1440"/>
+        <w:rPr>
+          <w:color w:val="000000" w:themeColor="text1"/>
+        </w:rPr>
+      </w:pPr>
+    </w:p>
+    <w:p>
+      <w:r>
+        <w:t>(It looks like the mistake of including type</w:t>
+      </w:r>
+      <w:proofErr w:type="gramStart"/>
+      <w:r>
+        <w:t>=“</w:t>
+      </w:r>
+      <w:proofErr w:type="gramEnd"/>
+      <w:r>
+        <w:t>m” for place started with Part 6.)</w:t>
+      </w:r>
+    </w:p>
+    <w:p/>
+    <w:p>
+      <w:r>
         <w:rPr>
           <w:b/>
           <w:bCs/>
         </w:rPr>
-      </w:pPr>
-    </w:p>
-    <w:p>
-      <w:r>
+        <w:t>Div Tags</w:t>
+      </w:r>
+      <w:r>
+        <w:t>:</w:t>
+      </w:r>
+    </w:p>
+    <w:p/>
+    <w:p>
+      <w:pPr>
+        <w:ind w:left="720"/>
+      </w:pPr>
+      <w:r>
+        <w:t xml:space="preserve">@type can be: </w:t>
+      </w:r>
+    </w:p>
+    <w:p>
+      <w:pPr>
+        <w:ind w:left="720"/>
+      </w:pPr>
+      <w:r>
+        <w:t>“</w:t>
+      </w:r>
+      <w:proofErr w:type="spellStart"/>
+      <w:r>
+        <w:t>paratext</w:t>
+      </w:r>
+      <w:proofErr w:type="spellEnd"/>
+      <w:r>
+        <w:t>” (accompanying materials written by Lynda – Chrono, letter lists, people, places)</w:t>
+      </w:r>
+    </w:p>
+    <w:p>
+      <w:pPr>
+        <w:ind w:left="720"/>
+      </w:pPr>
+      <w:r>
+        <w:t>“letter”</w:t>
+      </w:r>
+    </w:p>
+    <w:p>
+      <w:pPr>
+        <w:ind w:left="720"/>
+      </w:pPr>
+      <w:r>
+        <w:lastRenderedPageBreak/>
+        <w:t>“introduction”</w:t>
+      </w:r>
+    </w:p>
+    <w:p>
+      <w:pPr>
+        <w:ind w:left="720"/>
+      </w:pPr>
+      <w:r>
+        <w:t>“appendix”</w:t>
+      </w:r>
+    </w:p>
+    <w:p>
+      <w:pPr>
         <w:rPr>
           <w:b/>
           <w:bCs/>
         </w:rPr>
+      </w:pPr>
+    </w:p>
+    <w:p>
+      <w:r>
+        <w:rPr>
+          <w:b/>
+          <w:bCs/>
+        </w:rPr>
+        <w:t xml:space="preserve">Title: </w:t>
+      </w:r>
+      <w:r>
+        <w:t>Use &lt;title&gt; not &lt;term&gt;</w:t>
+      </w:r>
+    </w:p>
+    <w:p>
+      <w:pPr>
+        <w:rPr>
+          <w:b/>
+          <w:bCs/>
+        </w:rPr>
+      </w:pPr>
+    </w:p>
+    <w:p>
+      <w:r>
+        <w:rPr>
+          <w:b/>
+          <w:bCs/>
+        </w:rPr>
         <w:t>Tables</w:t>
       </w:r>
       <w:r>
@@ -563,7 +743,6 @@
         <w:ind w:left="720"/>
       </w:pPr>
       <w:r>
-        <w:lastRenderedPageBreak/>
         <w:tab/>
       </w:r>
       <w:r>
@@ -790,6 +969,7 @@
     </w:p>
     <w:p>
       <w:r>
+        <w:lastRenderedPageBreak/>
         <w:tab/>
       </w:r>
       <w:r>
@@ -1039,233 +1219,233 @@
     </w:p>
     <w:p>
       <w:r>
+        <w:tab/>
+        <w:t>&lt;floruit&gt;f. 1820-1830&lt;/floruit&gt;</w:t>
+      </w:r>
+    </w:p>
+    <w:p>
+      <w:pPr>
+        <w:ind w:left="1440"/>
+      </w:pPr>
+      <w:r>
+        <w:t xml:space="preserve">Can have birth, death, floruit, or none; can contain any symbols (b. </w:t>
+      </w:r>
+      <w:proofErr w:type="gramStart"/>
+      <w:r>
+        <w:t>d. ?</w:t>
+      </w:r>
+      <w:proofErr w:type="gramEnd"/>
+      <w:r>
+        <w:t xml:space="preserve"> etc.) but NO PARENTHESIS since these</w:t>
+      </w:r>
+      <w:r>
+        <w:t xml:space="preserve"> </w:t>
+      </w:r>
+      <w:r>
+        <w:t xml:space="preserve">are added </w:t>
+      </w:r>
+      <w:r>
+        <w:t xml:space="preserve">to the text when needed </w:t>
+      </w:r>
+      <w:r>
+        <w:t xml:space="preserve">by the </w:t>
+      </w:r>
+      <w:proofErr w:type="spellStart"/>
+      <w:r>
+        <w:t>xslt</w:t>
+      </w:r>
+      <w:proofErr w:type="spellEnd"/>
+      <w:r>
+        <w:t xml:space="preserve">. If no dates, </w:t>
+      </w:r>
+      <w:proofErr w:type="spellStart"/>
+      <w:r>
+        <w:t>xslt</w:t>
+      </w:r>
+      <w:proofErr w:type="spellEnd"/>
+      <w:r>
+        <w:t xml:space="preserve"> will leave blank; if "(dates unknown)" put it at the end of the bio note.)</w:t>
+      </w:r>
+    </w:p>
+    <w:p>
+      <w:r>
+        <w:t xml:space="preserve">            &lt;</w:t>
+      </w:r>
+      <w:proofErr w:type="spellStart"/>
+      <w:r>
+        <w:t>bibl</w:t>
+      </w:r>
+      <w:proofErr w:type="spellEnd"/>
+      <w:r>
+        <w:t>&gt;&lt;title ref="#</w:t>
+      </w:r>
+      <w:proofErr w:type="spellStart"/>
+      <w:r>
+        <w:t>dnb</w:t>
+      </w:r>
+      <w:proofErr w:type="spellEnd"/>
+      <w:r>
+        <w:t>"&gt;DNB&lt;/title&gt;, &lt;title ref="#hp"&gt;Hist P&lt;/title&gt;&lt;/</w:t>
+      </w:r>
+      <w:proofErr w:type="spellStart"/>
+      <w:r>
+        <w:t>bibl</w:t>
+      </w:r>
+      <w:proofErr w:type="spellEnd"/>
+      <w:r>
+        <w:t>&gt;</w:t>
+      </w:r>
+    </w:p>
+    <w:p>
+      <w:r>
+        <w:t xml:space="preserve">            &lt;note type="bio" target="#</w:t>
+      </w:r>
+      <w:proofErr w:type="spellStart"/>
+      <w:r>
+        <w:t>AbellaManuel</w:t>
+      </w:r>
+      <w:proofErr w:type="spellEnd"/>
+      <w:r>
+        <w:t>"&gt;</w:t>
+      </w:r>
+    </w:p>
+    <w:p>
+      <w:pPr>
+        <w:ind w:left="720" w:firstLine="720"/>
+      </w:pPr>
+      <w:r>
+        <w:t>[bio here]</w:t>
+      </w:r>
+    </w:p>
+    <w:p>
+      <w:r>
+        <w:t xml:space="preserve">            &lt;/note&gt;</w:t>
+      </w:r>
+    </w:p>
+    <w:p>
+      <w:r>
+        <w:t xml:space="preserve">        &lt;/person&gt; </w:t>
+      </w:r>
+    </w:p>
+    <w:p/>
+    <w:p>
+      <w:r>
+        <w:t>Other notes: when someone is known as multiple names, use additional surnames with types ("married", "birth", "grp", "dynasty"</w:t>
+      </w:r>
+    </w:p>
+    <w:p>
+      <w:r>
+        <w:tab/>
+      </w:r>
+      <w:r>
+        <w:tab/>
+      </w:r>
+      <w:r>
+        <w:tab/>
+      </w:r>
+      <w:r>
+        <w:tab/>
+      </w:r>
+    </w:p>
+    <w:p>
+      <w:pPr>
+        <w:ind w:firstLine="720"/>
+      </w:pPr>
+      <w:r>
+        <w:t>&lt;</w:t>
+      </w:r>
+      <w:proofErr w:type="spellStart"/>
+      <w:r>
+        <w:t>addName</w:t>
+      </w:r>
+      <w:proofErr w:type="spellEnd"/>
+      <w:r>
+        <w:t>&gt;</w:t>
+      </w:r>
+    </w:p>
+    <w:p>
+      <w:pPr>
+        <w:ind w:left="1440"/>
+      </w:pPr>
+      <w:r>
+        <w:t>Use</w:t>
+      </w:r>
+      <w:r>
+        <w:t xml:space="preserve"> &lt;</w:t>
+      </w:r>
+      <w:proofErr w:type="spellStart"/>
+      <w:r>
+        <w:t>addName</w:t>
+      </w:r>
+      <w:proofErr w:type="spellEnd"/>
+      <w:r>
+        <w:t xml:space="preserve"> type="</w:t>
+      </w:r>
+      <w:proofErr w:type="spellStart"/>
+      <w:r>
+        <w:t>akaF</w:t>
+      </w:r>
+      <w:proofErr w:type="spellEnd"/>
+      <w:r>
+        <w:t>"</w:t>
+      </w:r>
+      <w:r>
+        <w:t xml:space="preserve"> (another forename), "</w:t>
+      </w:r>
+      <w:proofErr w:type="spellStart"/>
+      <w:r>
+        <w:t>akaS</w:t>
+      </w:r>
+      <w:proofErr w:type="spellEnd"/>
+      <w:r>
+        <w:t>"</w:t>
+      </w:r>
+      <w:r>
+        <w:t xml:space="preserve"> (another surname), or "nickname" (enter a value without quotation marks) or "pseud"</w:t>
+      </w:r>
+    </w:p>
+    <w:p>
+      <w:r>
+        <w:t xml:space="preserve">These go inside the </w:t>
+      </w:r>
+      <w:proofErr w:type="spellStart"/>
+      <w:r>
+        <w:t>persName</w:t>
+      </w:r>
+      <w:proofErr w:type="spellEnd"/>
+      <w:r>
+        <w:t xml:space="preserve"> tag. If someone didn't go by their first name, it appears in the &lt;forename&gt; in parentheses--&gt;</w:t>
+      </w:r>
+    </w:p>
+    <w:p>
+      <w:r>
+        <w:tab/>
+      </w:r>
+      <w:r>
+        <w:tab/>
+      </w:r>
+      <w:r>
+        <w:tab/>
+      </w:r>
+      <w:r>
+        <w:tab/>
+      </w:r>
+    </w:p>
+    <w:p>
+      <w:r>
+        <w:tab/>
+      </w:r>
+      <w:r>
+        <w:tab/>
+      </w:r>
+      <w:r>
+        <w:tab/>
+        <w:t>for Royalty,</w:t>
+      </w:r>
+    </w:p>
+    <w:p>
+      <w:r>
         <w:lastRenderedPageBreak/>
-        <w:tab/>
-        <w:t>&lt;floruit&gt;f. 1820-1830&lt;/floruit&gt;</w:t>
-      </w:r>
-    </w:p>
-    <w:p>
-      <w:pPr>
-        <w:ind w:left="1440"/>
-      </w:pPr>
-      <w:r>
-        <w:t xml:space="preserve">Can have birth, death, floruit, or none; can contain any symbols (b. </w:t>
-      </w:r>
-      <w:proofErr w:type="gramStart"/>
-      <w:r>
-        <w:t>d. ?</w:t>
-      </w:r>
-      <w:proofErr w:type="gramEnd"/>
-      <w:r>
-        <w:t xml:space="preserve"> etc.) but NO PARENTHESIS since these</w:t>
-      </w:r>
-      <w:r>
-        <w:t xml:space="preserve"> </w:t>
-      </w:r>
-      <w:r>
-        <w:t xml:space="preserve">are added </w:t>
-      </w:r>
-      <w:r>
-        <w:t xml:space="preserve">to the text when needed </w:t>
-      </w:r>
-      <w:r>
-        <w:t xml:space="preserve">by the </w:t>
-      </w:r>
-      <w:proofErr w:type="spellStart"/>
-      <w:r>
-        <w:t>xslt</w:t>
-      </w:r>
-      <w:proofErr w:type="spellEnd"/>
-      <w:r>
-        <w:t xml:space="preserve">. If no dates, </w:t>
-      </w:r>
-      <w:proofErr w:type="spellStart"/>
-      <w:r>
-        <w:t>xslt</w:t>
-      </w:r>
-      <w:proofErr w:type="spellEnd"/>
-      <w:r>
-        <w:t xml:space="preserve"> will leave blank; if "(dates unknown)" put it at the end of the bio note.)</w:t>
-      </w:r>
-    </w:p>
-    <w:p>
-      <w:r>
-        <w:t xml:space="preserve">            &lt;</w:t>
-      </w:r>
-      <w:proofErr w:type="spellStart"/>
-      <w:r>
-        <w:t>bibl</w:t>
-      </w:r>
-      <w:proofErr w:type="spellEnd"/>
-      <w:r>
-        <w:t>&gt;&lt;title ref="#</w:t>
-      </w:r>
-      <w:proofErr w:type="spellStart"/>
-      <w:r>
-        <w:t>dnb</w:t>
-      </w:r>
-      <w:proofErr w:type="spellEnd"/>
-      <w:r>
-        <w:t>"&gt;DNB&lt;/title&gt;, &lt;title ref="#hp"&gt;Hist P&lt;/title&gt;&lt;/</w:t>
-      </w:r>
-      <w:proofErr w:type="spellStart"/>
-      <w:r>
-        <w:t>bibl</w:t>
-      </w:r>
-      <w:proofErr w:type="spellEnd"/>
-      <w:r>
-        <w:t>&gt;</w:t>
-      </w:r>
-    </w:p>
-    <w:p>
-      <w:r>
-        <w:t xml:space="preserve">            &lt;note type="bio" target="#</w:t>
-      </w:r>
-      <w:proofErr w:type="spellStart"/>
-      <w:r>
-        <w:t>AbellaManuel</w:t>
-      </w:r>
-      <w:proofErr w:type="spellEnd"/>
-      <w:r>
-        <w:t>"&gt;</w:t>
-      </w:r>
-    </w:p>
-    <w:p>
-      <w:pPr>
-        <w:ind w:left="720" w:firstLine="720"/>
-      </w:pPr>
-      <w:r>
-        <w:t>[bio here]</w:t>
-      </w:r>
-    </w:p>
-    <w:p>
-      <w:r>
-        <w:t xml:space="preserve">            &lt;/note&gt;</w:t>
-      </w:r>
-    </w:p>
-    <w:p>
-      <w:r>
-        <w:t xml:space="preserve">        &lt;/person&gt; </w:t>
-      </w:r>
-    </w:p>
-    <w:p/>
-    <w:p>
-      <w:r>
-        <w:t>Other notes: when someone is known as multiple names, use additional surnames with types ("married", "birth", "grp", "dynasty"</w:t>
-      </w:r>
-    </w:p>
-    <w:p>
-      <w:r>
-        <w:tab/>
-      </w:r>
-      <w:r>
-        <w:tab/>
-      </w:r>
-      <w:r>
-        <w:tab/>
-      </w:r>
-      <w:r>
-        <w:tab/>
-      </w:r>
-    </w:p>
-    <w:p>
-      <w:pPr>
-        <w:ind w:firstLine="720"/>
-      </w:pPr>
-      <w:r>
-        <w:t>&lt;</w:t>
-      </w:r>
-      <w:proofErr w:type="spellStart"/>
-      <w:r>
-        <w:t>addName</w:t>
-      </w:r>
-      <w:proofErr w:type="spellEnd"/>
-      <w:r>
-        <w:t>&gt;</w:t>
-      </w:r>
-    </w:p>
-    <w:p>
-      <w:pPr>
-        <w:ind w:left="1440"/>
-      </w:pPr>
-      <w:r>
-        <w:t>Use</w:t>
-      </w:r>
-      <w:r>
-        <w:t xml:space="preserve"> &lt;</w:t>
-      </w:r>
-      <w:proofErr w:type="spellStart"/>
-      <w:r>
-        <w:t>addName</w:t>
-      </w:r>
-      <w:proofErr w:type="spellEnd"/>
-      <w:r>
-        <w:t xml:space="preserve"> type="</w:t>
-      </w:r>
-      <w:proofErr w:type="spellStart"/>
-      <w:r>
-        <w:t>akaF</w:t>
-      </w:r>
-      <w:proofErr w:type="spellEnd"/>
-      <w:r>
-        <w:t>"</w:t>
-      </w:r>
-      <w:r>
-        <w:t xml:space="preserve"> (another forename), "</w:t>
-      </w:r>
-      <w:proofErr w:type="spellStart"/>
-      <w:r>
-        <w:t>akaS</w:t>
-      </w:r>
-      <w:proofErr w:type="spellEnd"/>
-      <w:r>
-        <w:t>"</w:t>
-      </w:r>
-      <w:r>
-        <w:t xml:space="preserve"> (another surname), or "nickname" (enter a value without quotation marks) or "pseud"</w:t>
-      </w:r>
-    </w:p>
-    <w:p>
-      <w:r>
-        <w:t xml:space="preserve">These go inside the </w:t>
-      </w:r>
-      <w:proofErr w:type="spellStart"/>
-      <w:r>
-        <w:t>persName</w:t>
-      </w:r>
-      <w:proofErr w:type="spellEnd"/>
-      <w:r>
-        <w:t xml:space="preserve"> tag. If someone didn't go by their first name, it appears in the &lt;forename&gt; in parentheses--&gt;</w:t>
-      </w:r>
-    </w:p>
-    <w:p>
-      <w:r>
-        <w:tab/>
-      </w:r>
-      <w:r>
-        <w:tab/>
-      </w:r>
-      <w:r>
-        <w:tab/>
-      </w:r>
-      <w:r>
-        <w:tab/>
-      </w:r>
-    </w:p>
-    <w:p>
-      <w:r>
-        <w:tab/>
-      </w:r>
-      <w:r>
-        <w:tab/>
-      </w:r>
-      <w:r>
-        <w:tab/>
-        <w:t>for Royalty,</w:t>
-      </w:r>
-    </w:p>
-    <w:p>
-      <w:r>
         <w:tab/>
       </w:r>
       <w:r>
@@ -1596,7 +1776,6 @@
           <w:kern w:val="0"/>
           <w:highlight w:val="white"/>
         </w:rPr>
-        <w:lastRenderedPageBreak/>
         <w:t>&lt;p&gt;</w:t>
       </w:r>
       <w:r>

</xml_diff>

<commit_message>
adding Blank search page
</commit_message>
<xml_diff>
--- a/SoutheyLetters/For SOUTHEY MANUAL.docx
+++ b/SoutheyLetters/For SOUTHEY MANUAL.docx
@@ -1,6 +1,6 @@
 
 <file path=word/document.xml><?xml version="1.0" encoding="utf-8"?>
-<w:document xmlns:wpc="http://schemas.microsoft.com/office/word/2010/wordprocessingCanvas" xmlns:cx="http://schemas.microsoft.com/office/drawing/2014/chartex" xmlns:cx1="http://schemas.microsoft.com/office/drawing/2015/9/8/chartex" xmlns:cx2="http://schemas.microsoft.com/office/drawing/2015/10/21/chartex" xmlns:cx3="http://schemas.microsoft.com/office/drawing/2016/5/9/chartex" xmlns:cx4="http://schemas.microsoft.com/office/drawing/2016/5/10/chartex" xmlns:cx5="http://schemas.microsoft.com/office/drawing/2016/5/11/chartex" xmlns:cx6="http://schemas.microsoft.com/office/drawing/2016/5/12/chartex" xmlns:cx7="http://schemas.microsoft.com/office/drawing/2016/5/13/chartex" xmlns:cx8="http://schemas.microsoft.com/office/drawing/2016/5/14/chartex" xmlns:mc="http://schemas.openxmlformats.org/markup-compatibility/2006" xmlns:m="http://schemas.openxmlformats.org/officeDocument/2006/math" xmlns:aink="http://schemas.microsoft.com/office/drawing/2016/ink" xmlns:am3d="http://schemas.microsoft.com/office/drawing/2017/model3d" xmlns:oel="http://schemas.microsoft.com/office/2019/extlst" xmlns:r="http://schemas.openxmlformats.org/officeDocument/2006/relationships" xmlns:wp14="http://schemas.microsoft.com/office/word/2010/wordprocessingDrawing" xmlns:wp="http://schemas.openxmlformats.org/drawingml/2006/wordprocessingDrawing" xmlns:wpg="http://schemas.microsoft.com/office/word/2010/wordprocessingGroup" xmlns:wpi="http://schemas.microsoft.com/office/word/2010/wordprocessingInk" xmlns:wps="http://schemas.microsoft.com/office/word/2010/wordprocessingShape" xmlns:o="urn:schemas-microsoft-com:office:office" xmlns:v="urn:schemas-microsoft-com:vml" xmlns:w10="urn:schemas-microsoft-com:office:word" xmlns:w="http://schemas.openxmlformats.org/wordprocessingml/2006/main" xmlns:w14="http://schemas.microsoft.com/office/word/2010/wordml" xmlns:w15="http://schemas.microsoft.com/office/word/2012/wordml" xmlns:w16cei="http://schemas.microsoft.com/office/word/2026/wordml/cei" xmlns:w16cex="http://schemas.microsoft.com/office/word/2018/wordml/cex" xmlns:w16cid="http://schemas.microsoft.com/office/word/2016/wordml/cid" xmlns:w16="http://schemas.microsoft.com/office/word/2018/wordml" xmlns:w16sdtdh="http://schemas.microsoft.com/office/word/2020/wordml/sdtdatahash" xmlns:w16sdtfl="http://schemas.microsoft.com/office/word/2024/wordml/sdtformatlock" xmlns:w16se="http://schemas.microsoft.com/office/word/2015/wordml/symex" xmlns:w16du="http://schemas.microsoft.com/office/word/2023/wordml/word16du" xmlns:wne="http://schemas.microsoft.com/office/word/2006/wordml" mc:Ignorable="w14 w15 w16se w16cid w16 w16cex w16sdtdh w16sdtfl w16du wp14">
+<w:document xmlns:wpc="http://schemas.microsoft.com/office/word/2010/wordprocessingCanvas" xmlns:cx="http://schemas.microsoft.com/office/drawing/2014/chartex" xmlns:cx1="http://schemas.microsoft.com/office/drawing/2015/9/8/chartex" xmlns:cx2="http://schemas.microsoft.com/office/drawing/2015/10/21/chartex" xmlns:cx3="http://schemas.microsoft.com/office/drawing/2016/5/9/chartex" xmlns:cx4="http://schemas.microsoft.com/office/drawing/2016/5/10/chartex" xmlns:cx5="http://schemas.microsoft.com/office/drawing/2016/5/11/chartex" xmlns:cx6="http://schemas.microsoft.com/office/drawing/2016/5/12/chartex" xmlns:cx7="http://schemas.microsoft.com/office/drawing/2016/5/13/chartex" xmlns:cx8="http://schemas.microsoft.com/office/drawing/2016/5/14/chartex" xmlns:mc="http://schemas.openxmlformats.org/markup-compatibility/2006" xmlns:m="http://schemas.openxmlformats.org/officeDocument/2006/math" xmlns:aink="http://schemas.microsoft.com/office/drawing/2016/ink" xmlns:am3d="http://schemas.microsoft.com/office/drawing/2017/model3d" xmlns:oel="http://schemas.microsoft.com/office/2019/extlst" xmlns:r="http://schemas.openxmlformats.org/officeDocument/2006/relationships" xmlns:wp14="http://schemas.microsoft.com/office/word/2010/wordprocessingDrawing" xmlns:wp="http://schemas.openxmlformats.org/drawingml/2006/wordprocessingDrawing" xmlns:wpg="http://schemas.microsoft.com/office/word/2010/wordprocessingGroup" xmlns:wpi="http://schemas.microsoft.com/office/word/2010/wordprocessingInk" xmlns:wps="http://schemas.microsoft.com/office/word/2010/wordprocessingShape" xmlns:o="urn:schemas-microsoft-com:office:office" xmlns:v="urn:schemas-microsoft-com:vml" xmlns:w10="urn:schemas-microsoft-com:office:word" xmlns:w="http://schemas.openxmlformats.org/wordprocessingml/2006/main" xmlns:w14="http://schemas.microsoft.com/office/word/2010/wordml" xmlns:w15="http://schemas.microsoft.com/office/word/2012/wordml" xmlns:w16cex="http://schemas.microsoft.com/office/word/2018/wordml/cex" xmlns:w16cid="http://schemas.microsoft.com/office/word/2016/wordml/cid" xmlns:w16="http://schemas.microsoft.com/office/word/2018/wordml" xmlns:w16sdtdh="http://schemas.microsoft.com/office/word/2020/wordml/sdtdatahash" xmlns:w16sdtfl="http://schemas.microsoft.com/office/word/2024/wordml/sdtformatlock" xmlns:w16se="http://schemas.microsoft.com/office/word/2015/wordml/symex" xmlns:w16du="http://schemas.microsoft.com/office/word/2023/wordml/word16du" xmlns:wne="http://schemas.microsoft.com/office/word/2006/wordml" mc:Ignorable="w14 w15 w16se w16cid w16 w16cex w16sdtdh w16sdtfl w16du wp14">
   <w:body>
     <w:p>
       <w:r>
@@ -677,6 +677,18 @@
         <w:t>“appendix”</w:t>
       </w:r>
     </w:p>
+    <w:p/>
+    <w:p>
+      <w:r>
+        <w:lastRenderedPageBreak/>
+        <w:t xml:space="preserve">In HTML only: “notes” – generate automatically by the </w:t>
+      </w:r>
+      <w:proofErr w:type="spellStart"/>
+      <w:r>
+        <w:t>xslt</w:t>
+      </w:r>
+      <w:proofErr w:type="spellEnd"/>
+    </w:p>
     <w:p>
       <w:pPr>
         <w:rPr>
@@ -691,7 +703,6 @@
           <w:b/>
           <w:bCs/>
         </w:rPr>
-        <w:lastRenderedPageBreak/>
         <w:t xml:space="preserve">Title: </w:t>
       </w:r>
       <w:r>
@@ -764,17 +775,52 @@
       </w:r>
     </w:p>
     <w:p/>
+    <w:p>
+      <w:r>
+        <w:t xml:space="preserve">Averill, if you could use this tagging scheme in the </w:t>
+      </w:r>
+      <w:proofErr w:type="gramStart"/>
+      <w:r>
+        <w:t>letters, and</w:t>
+      </w:r>
+      <w:proofErr w:type="gramEnd"/>
+      <w:r>
+        <w:t xml:space="preserve"> then tell me the widths / styles you want in comment tags, I can write the &lt;</w:t>
+      </w:r>
+      <w:proofErr w:type="spellStart"/>
+      <w:r>
+        <w:t>encodingDesc</w:t>
+      </w:r>
+      <w:proofErr w:type="spellEnd"/>
+      <w:r>
+        <w:t xml:space="preserve">&gt; for the </w:t>
+      </w:r>
+      <w:proofErr w:type="spellStart"/>
+      <w:r>
+        <w:t>teiHeader</w:t>
+      </w:r>
+      <w:proofErr w:type="spellEnd"/>
+      <w:r>
+        <w:t>.</w:t>
+      </w:r>
+    </w:p>
     <w:p/>
     <w:p>
       <w:pPr>
         <w:ind w:left="720"/>
       </w:pPr>
       <w:r>
-        <w:t>&lt;table rendition=#</w:t>
+        <w:t>&lt;table rendition=#tbl</w:t>
+      </w:r>
+      <w:r>
+        <w:t>450</w:t>
       </w:r>
       <w:proofErr w:type="gramStart"/>
       <w:r>
-        <w:t>tbl[</w:t>
+        <w:t xml:space="preserve">   </w:t>
+      </w:r>
+      <w:r>
+        <w:t>[</w:t>
       </w:r>
       <w:proofErr w:type="gramEnd"/>
       <w:r>
@@ -873,6 +919,11 @@
       <w:pPr>
         <w:ind w:left="720"/>
       </w:pPr>
+    </w:p>
+    <w:p>
+      <w:pPr>
+        <w:ind w:left="720"/>
+      </w:pPr>
       <w:r>
         <w:t>&lt;</w:t>
       </w:r>
@@ -944,14 +995,12 @@
       </w:r>
       <w:proofErr w:type="spellEnd"/>
       <w:r>
-        <w:t>="</w:t>
-      </w:r>
-      <w:proofErr w:type="spellStart"/>
+        <w:t>="tbl</w:t>
+      </w:r>
       <w:proofErr w:type="gramStart"/>
       <w:r>
-        <w:t>tbl</w:t>
-      </w:r>
-      <w:proofErr w:type="spellEnd"/>
+        <w:t xml:space="preserve">450  </w:t>
+      </w:r>
       <w:r>
         <w:t>[</w:t>
       </w:r>
@@ -1047,7 +1096,6 @@
       </w:pPr>
       <w:r>
         <w:tab/>
-        <w:t>&lt;</w:t>
       </w:r>
     </w:p>
     <w:p>
@@ -1132,6 +1180,7 @@
     </w:p>
     <w:p>
       <w:r>
+        <w:lastRenderedPageBreak/>
         <w:tab/>
       </w:r>
       <w:r>
@@ -1183,18 +1232,6 @@
       </w:r>
     </w:p>
     <w:p/>
-    <w:p>
-      <w:r>
-        <w:lastRenderedPageBreak/>
-        <w:t xml:space="preserve">forename </w:t>
-      </w:r>
-      <w:r>
-        <w:t xml:space="preserve">attributes: </w:t>
-      </w:r>
-      <w:r>
-        <w:t>none or type = grp</w:t>
-      </w:r>
-    </w:p>
     <w:p>
       <w:pPr>
         <w:shd w:val="clear" w:color="auto" w:fill="FFFFFF"/>
@@ -1203,6 +1240,753 @@
         <w:adjustRightInd w:val="0"/>
         <w:rPr>
           <w:rFonts w:ascii="Times New Roman" w:hAnsi="Times New Roman" w:cs="Times New Roman"/>
+          <w:color w:val="000096"/>
+          <w:kern w:val="0"/>
+          <w:highlight w:val="white"/>
+        </w:rPr>
+      </w:pPr>
+      <w:r>
+        <w:rPr>
+          <w:rFonts w:ascii="Times New Roman" w:hAnsi="Times New Roman" w:cs="Times New Roman"/>
+          <w:color w:val="000096"/>
+          <w:kern w:val="0"/>
+          <w:highlight w:val="white"/>
+        </w:rPr>
+        <w:t>&lt;</w:t>
+      </w:r>
+      <w:proofErr w:type="spellStart"/>
+      <w:r>
+        <w:rPr>
+          <w:rFonts w:ascii="Times New Roman" w:hAnsi="Times New Roman" w:cs="Times New Roman"/>
+          <w:color w:val="000096"/>
+          <w:kern w:val="0"/>
+          <w:highlight w:val="white"/>
+        </w:rPr>
+        <w:t>persName</w:t>
+      </w:r>
+      <w:proofErr w:type="spellEnd"/>
+      <w:r>
+        <w:rPr>
+          <w:rFonts w:ascii="Times New Roman" w:hAnsi="Times New Roman" w:cs="Times New Roman"/>
+          <w:color w:val="F5844C"/>
+          <w:kern w:val="0"/>
+          <w:highlight w:val="white"/>
+        </w:rPr>
+        <w:t xml:space="preserve"> </w:t>
+      </w:r>
+      <w:proofErr w:type="spellStart"/>
+      <w:r>
+        <w:rPr>
+          <w:rFonts w:ascii="Times New Roman" w:hAnsi="Times New Roman" w:cs="Times New Roman"/>
+          <w:color w:val="F5844C"/>
+          <w:kern w:val="0"/>
+          <w:highlight w:val="white"/>
+        </w:rPr>
+        <w:t>xml:id</w:t>
+      </w:r>
+      <w:proofErr w:type="spellEnd"/>
+      <w:r>
+        <w:rPr>
+          <w:rFonts w:ascii="Times New Roman" w:hAnsi="Times New Roman" w:cs="Times New Roman"/>
+          <w:color w:val="FF8040"/>
+          <w:kern w:val="0"/>
+          <w:highlight w:val="white"/>
+        </w:rPr>
+        <w:t>=</w:t>
+      </w:r>
+      <w:r>
+        <w:rPr>
+          <w:rFonts w:ascii="Times New Roman" w:hAnsi="Times New Roman" w:cs="Times New Roman"/>
+          <w:color w:val="993300"/>
+          <w:kern w:val="0"/>
+          <w:highlight w:val="white"/>
+        </w:rPr>
+        <w:t>"</w:t>
+      </w:r>
+      <w:proofErr w:type="spellStart"/>
+      <w:r>
+        <w:rPr>
+          <w:rFonts w:ascii="Times New Roman" w:hAnsi="Times New Roman" w:cs="Times New Roman"/>
+          <w:color w:val="993300"/>
+          <w:kern w:val="0"/>
+          <w:highlight w:val="white"/>
+        </w:rPr>
+        <w:t>AttersollAnn</w:t>
+      </w:r>
+      <w:proofErr w:type="spellEnd"/>
+      <w:r>
+        <w:rPr>
+          <w:rFonts w:ascii="Times New Roman" w:hAnsi="Times New Roman" w:cs="Times New Roman"/>
+          <w:color w:val="993300"/>
+          <w:kern w:val="0"/>
+          <w:highlight w:val="white"/>
+        </w:rPr>
+        <w:t>"</w:t>
+      </w:r>
+      <w:r>
+        <w:rPr>
+          <w:rFonts w:ascii="Times New Roman" w:hAnsi="Times New Roman" w:cs="Times New Roman"/>
+          <w:color w:val="000096"/>
+          <w:kern w:val="0"/>
+          <w:highlight w:val="white"/>
+        </w:rPr>
+        <w:t>&gt;</w:t>
+      </w:r>
+    </w:p>
+    <w:p>
+      <w:pPr>
+        <w:shd w:val="clear" w:color="auto" w:fill="FFFFFF"/>
+        <w:autoSpaceDE w:val="0"/>
+        <w:autoSpaceDN w:val="0"/>
+        <w:adjustRightInd w:val="0"/>
+        <w:rPr>
+          <w:rFonts w:ascii="Times New Roman" w:hAnsi="Times New Roman" w:cs="Times New Roman"/>
+          <w:color w:val="000096"/>
+          <w:kern w:val="0"/>
+          <w:highlight w:val="white"/>
+        </w:rPr>
+      </w:pPr>
+      <w:r>
+        <w:rPr>
+          <w:rFonts w:ascii="Times New Roman" w:hAnsi="Times New Roman" w:cs="Times New Roman"/>
+          <w:color w:val="000096"/>
+          <w:kern w:val="0"/>
+          <w:highlight w:val="white"/>
+        </w:rPr>
+        <w:t>&lt;forename&gt;</w:t>
+      </w:r>
+      <w:r>
+        <w:rPr>
+          <w:rFonts w:ascii="Times New Roman" w:hAnsi="Times New Roman" w:cs="Times New Roman"/>
+          <w:color w:val="000000"/>
+          <w:kern w:val="0"/>
+          <w:highlight w:val="white"/>
+        </w:rPr>
+        <w:t>Ann</w:t>
+      </w:r>
+      <w:r>
+        <w:rPr>
+          <w:rFonts w:ascii="Times New Roman" w:hAnsi="Times New Roman" w:cs="Times New Roman"/>
+          <w:color w:val="000096"/>
+          <w:kern w:val="0"/>
+          <w:highlight w:val="white"/>
+        </w:rPr>
+        <w:t>&lt;/forename&gt;</w:t>
+      </w:r>
+    </w:p>
+    <w:p>
+      <w:pPr>
+        <w:shd w:val="clear" w:color="auto" w:fill="FFFFFF"/>
+        <w:autoSpaceDE w:val="0"/>
+        <w:autoSpaceDN w:val="0"/>
+        <w:adjustRightInd w:val="0"/>
+        <w:rPr>
+          <w:rFonts w:ascii="Times New Roman" w:hAnsi="Times New Roman" w:cs="Times New Roman"/>
+          <w:color w:val="000096"/>
+          <w:kern w:val="0"/>
+          <w:highlight w:val="white"/>
+        </w:rPr>
+      </w:pPr>
+      <w:proofErr w:type="spellStart"/>
+      <w:r>
+        <w:rPr>
+          <w:rFonts w:ascii="Times New Roman" w:hAnsi="Times New Roman" w:cs="Times New Roman"/>
+          <w:color w:val="000096"/>
+          <w:kern w:val="0"/>
+          <w:highlight w:val="white"/>
+        </w:rPr>
+        <w:t>&lt;addNam</w:t>
+      </w:r>
+      <w:proofErr w:type="spellEnd"/>
+      <w:r>
+        <w:rPr>
+          <w:rFonts w:ascii="Times New Roman" w:hAnsi="Times New Roman" w:cs="Times New Roman"/>
+          <w:color w:val="000096"/>
+          <w:kern w:val="0"/>
+          <w:highlight w:val="white"/>
+        </w:rPr>
+        <w:t>e</w:t>
+      </w:r>
+      <w:r>
+        <w:rPr>
+          <w:rFonts w:ascii="Times New Roman" w:hAnsi="Times New Roman" w:cs="Times New Roman"/>
+          <w:color w:val="F5844C"/>
+          <w:kern w:val="0"/>
+          <w:highlight w:val="white"/>
+        </w:rPr>
+        <w:t xml:space="preserve"> type</w:t>
+      </w:r>
+      <w:r>
+        <w:rPr>
+          <w:rFonts w:ascii="Times New Roman" w:hAnsi="Times New Roman" w:cs="Times New Roman"/>
+          <w:color w:val="FF8040"/>
+          <w:kern w:val="0"/>
+          <w:highlight w:val="white"/>
+        </w:rPr>
+        <w:t>=</w:t>
+      </w:r>
+      <w:r>
+        <w:rPr>
+          <w:rFonts w:ascii="Times New Roman" w:hAnsi="Times New Roman" w:cs="Times New Roman"/>
+          <w:color w:val="993300"/>
+          <w:kern w:val="0"/>
+          <w:highlight w:val="white"/>
+        </w:rPr>
+        <w:t>"</w:t>
+      </w:r>
+      <w:proofErr w:type="spellStart"/>
+      <w:r>
+        <w:rPr>
+          <w:rFonts w:ascii="Times New Roman" w:hAnsi="Times New Roman" w:cs="Times New Roman"/>
+          <w:color w:val="993300"/>
+          <w:kern w:val="0"/>
+          <w:highlight w:val="white"/>
+        </w:rPr>
+        <w:t>akaS</w:t>
+      </w:r>
+      <w:proofErr w:type="spellEnd"/>
+      <w:r>
+        <w:rPr>
+          <w:rFonts w:ascii="Times New Roman" w:hAnsi="Times New Roman" w:cs="Times New Roman"/>
+          <w:color w:val="993300"/>
+          <w:kern w:val="0"/>
+          <w:highlight w:val="white"/>
+        </w:rPr>
+        <w:t>"</w:t>
+      </w:r>
+      <w:r>
+        <w:rPr>
+          <w:rFonts w:ascii="Times New Roman" w:hAnsi="Times New Roman" w:cs="Times New Roman"/>
+          <w:color w:val="000096"/>
+          <w:kern w:val="0"/>
+          <w:highlight w:val="white"/>
+        </w:rPr>
+        <w:t>&gt;</w:t>
+      </w:r>
+      <w:r>
+        <w:rPr>
+          <w:rFonts w:ascii="Times New Roman" w:hAnsi="Times New Roman" w:cs="Times New Roman"/>
+          <w:color w:val="000000"/>
+          <w:kern w:val="0"/>
+          <w:highlight w:val="white"/>
+        </w:rPr>
+        <w:t>Hunter</w:t>
+      </w:r>
+      <w:r>
+        <w:rPr>
+          <w:rFonts w:ascii="Times New Roman" w:hAnsi="Times New Roman" w:cs="Times New Roman"/>
+          <w:color w:val="000096"/>
+          <w:kern w:val="0"/>
+          <w:highlight w:val="white"/>
+        </w:rPr>
+        <w:t>&lt;/</w:t>
+      </w:r>
+      <w:proofErr w:type="spellStart"/>
+      <w:r>
+        <w:rPr>
+          <w:rFonts w:ascii="Times New Roman" w:hAnsi="Times New Roman" w:cs="Times New Roman"/>
+          <w:color w:val="000096"/>
+          <w:kern w:val="0"/>
+          <w:highlight w:val="white"/>
+        </w:rPr>
+        <w:t>addName</w:t>
+      </w:r>
+      <w:proofErr w:type="spellEnd"/>
+      <w:r>
+        <w:rPr>
+          <w:rFonts w:ascii="Times New Roman" w:hAnsi="Times New Roman" w:cs="Times New Roman"/>
+          <w:color w:val="000096"/>
+          <w:kern w:val="0"/>
+          <w:highlight w:val="white"/>
+        </w:rPr>
+        <w:t>&gt;</w:t>
+      </w:r>
+    </w:p>
+    <w:p>
+      <w:pPr>
+        <w:shd w:val="clear" w:color="auto" w:fill="FFFFFF"/>
+        <w:autoSpaceDE w:val="0"/>
+        <w:autoSpaceDN w:val="0"/>
+        <w:adjustRightInd w:val="0"/>
+        <w:rPr>
+          <w:rFonts w:ascii="Times New Roman" w:hAnsi="Times New Roman" w:cs="Times New Roman"/>
+          <w:color w:val="000096"/>
+          <w:kern w:val="0"/>
+          <w:highlight w:val="white"/>
+        </w:rPr>
+      </w:pPr>
+      <w:r>
+        <w:rPr>
+          <w:rFonts w:ascii="Times New Roman" w:hAnsi="Times New Roman" w:cs="Times New Roman"/>
+          <w:color w:val="000096"/>
+          <w:kern w:val="0"/>
+          <w:highlight w:val="white"/>
+        </w:rPr>
+        <w:t>&lt;</w:t>
+      </w:r>
+      <w:proofErr w:type="spellStart"/>
+      <w:r>
+        <w:rPr>
+          <w:rFonts w:ascii="Times New Roman" w:hAnsi="Times New Roman" w:cs="Times New Roman"/>
+          <w:color w:val="000096"/>
+          <w:kern w:val="0"/>
+          <w:highlight w:val="white"/>
+        </w:rPr>
+        <w:t>addName</w:t>
+      </w:r>
+      <w:proofErr w:type="spellEnd"/>
+      <w:r>
+        <w:rPr>
+          <w:rFonts w:ascii="Times New Roman" w:hAnsi="Times New Roman" w:cs="Times New Roman"/>
+          <w:color w:val="F5844C"/>
+          <w:kern w:val="0"/>
+          <w:highlight w:val="white"/>
+        </w:rPr>
+        <w:t xml:space="preserve"> type</w:t>
+      </w:r>
+      <w:r>
+        <w:rPr>
+          <w:rFonts w:ascii="Times New Roman" w:hAnsi="Times New Roman" w:cs="Times New Roman"/>
+          <w:color w:val="FF8040"/>
+          <w:kern w:val="0"/>
+          <w:highlight w:val="white"/>
+        </w:rPr>
+        <w:t>=</w:t>
+      </w:r>
+      <w:r>
+        <w:rPr>
+          <w:rFonts w:ascii="Times New Roman" w:hAnsi="Times New Roman" w:cs="Times New Roman"/>
+          <w:color w:val="993300"/>
+          <w:kern w:val="0"/>
+          <w:highlight w:val="white"/>
+        </w:rPr>
+        <w:t>"</w:t>
+      </w:r>
+      <w:proofErr w:type="spellStart"/>
+      <w:r>
+        <w:rPr>
+          <w:rFonts w:ascii="Times New Roman" w:hAnsi="Times New Roman" w:cs="Times New Roman"/>
+          <w:color w:val="993300"/>
+          <w:kern w:val="0"/>
+          <w:highlight w:val="white"/>
+        </w:rPr>
+        <w:t>akaS</w:t>
+      </w:r>
+      <w:proofErr w:type="spellEnd"/>
+      <w:r>
+        <w:rPr>
+          <w:rFonts w:ascii="Times New Roman" w:hAnsi="Times New Roman" w:cs="Times New Roman"/>
+          <w:color w:val="993300"/>
+          <w:kern w:val="0"/>
+          <w:highlight w:val="white"/>
+        </w:rPr>
+        <w:t>"</w:t>
+      </w:r>
+      <w:r>
+        <w:rPr>
+          <w:rFonts w:ascii="Times New Roman" w:hAnsi="Times New Roman" w:cs="Times New Roman"/>
+          <w:color w:val="000096"/>
+          <w:kern w:val="0"/>
+          <w:highlight w:val="white"/>
+        </w:rPr>
+        <w:t>&gt;</w:t>
+      </w:r>
+      <w:r>
+        <w:rPr>
+          <w:rFonts w:ascii="Times New Roman" w:hAnsi="Times New Roman" w:cs="Times New Roman"/>
+          <w:color w:val="000000"/>
+          <w:kern w:val="0"/>
+          <w:highlight w:val="white"/>
+        </w:rPr>
+        <w:t>Doherty</w:t>
+      </w:r>
+      <w:r>
+        <w:rPr>
+          <w:rFonts w:ascii="Times New Roman" w:hAnsi="Times New Roman" w:cs="Times New Roman"/>
+          <w:color w:val="000096"/>
+          <w:kern w:val="0"/>
+          <w:highlight w:val="white"/>
+        </w:rPr>
+        <w:t>&lt;/</w:t>
+      </w:r>
+      <w:proofErr w:type="spellStart"/>
+      <w:r>
+        <w:rPr>
+          <w:rFonts w:ascii="Times New Roman" w:hAnsi="Times New Roman" w:cs="Times New Roman"/>
+          <w:color w:val="000096"/>
+          <w:kern w:val="0"/>
+          <w:highlight w:val="white"/>
+        </w:rPr>
+        <w:t>addName</w:t>
+      </w:r>
+      <w:proofErr w:type="spellEnd"/>
+      <w:r>
+        <w:rPr>
+          <w:rFonts w:ascii="Times New Roman" w:hAnsi="Times New Roman" w:cs="Times New Roman"/>
+          <w:color w:val="000096"/>
+          <w:kern w:val="0"/>
+          <w:highlight w:val="white"/>
+        </w:rPr>
+        <w:t>&gt;</w:t>
+      </w:r>
+    </w:p>
+    <w:p>
+      <w:pPr>
+        <w:shd w:val="clear" w:color="auto" w:fill="FFFFFF"/>
+        <w:autoSpaceDE w:val="0"/>
+        <w:autoSpaceDN w:val="0"/>
+        <w:adjustRightInd w:val="0"/>
+        <w:rPr>
+          <w:rFonts w:ascii="Times New Roman" w:hAnsi="Times New Roman" w:cs="Times New Roman"/>
+          <w:color w:val="000096"/>
+          <w:kern w:val="0"/>
+          <w:highlight w:val="white"/>
+        </w:rPr>
+      </w:pPr>
+      <w:r>
+        <w:rPr>
+          <w:rFonts w:ascii="Times New Roman" w:hAnsi="Times New Roman" w:cs="Times New Roman"/>
+          <w:color w:val="000096"/>
+          <w:kern w:val="0"/>
+          <w:highlight w:val="white"/>
+        </w:rPr>
+        <w:t>&lt;</w:t>
+      </w:r>
+      <w:proofErr w:type="spellStart"/>
+      <w:r>
+        <w:rPr>
+          <w:rFonts w:ascii="Times New Roman" w:hAnsi="Times New Roman" w:cs="Times New Roman"/>
+          <w:color w:val="000096"/>
+          <w:kern w:val="0"/>
+          <w:highlight w:val="white"/>
+        </w:rPr>
+        <w:t>addName</w:t>
+      </w:r>
+      <w:proofErr w:type="spellEnd"/>
+      <w:r>
+        <w:rPr>
+          <w:rFonts w:ascii="Times New Roman" w:hAnsi="Times New Roman" w:cs="Times New Roman"/>
+          <w:color w:val="000000"/>
+          <w:kern w:val="0"/>
+          <w:highlight w:val="white"/>
+        </w:rPr>
+        <w:t xml:space="preserve"> </w:t>
+      </w:r>
+      <w:r>
+        <w:rPr>
+          <w:rFonts w:ascii="Times New Roman" w:hAnsi="Times New Roman" w:cs="Times New Roman"/>
+          <w:color w:val="F5844C"/>
+          <w:kern w:val="0"/>
+          <w:highlight w:val="white"/>
+        </w:rPr>
+        <w:t>type</w:t>
+      </w:r>
+      <w:r>
+        <w:rPr>
+          <w:rFonts w:ascii="Times New Roman" w:hAnsi="Times New Roman" w:cs="Times New Roman"/>
+          <w:color w:val="FF8040"/>
+          <w:kern w:val="0"/>
+          <w:highlight w:val="white"/>
+        </w:rPr>
+        <w:t>=</w:t>
+      </w:r>
+      <w:r>
+        <w:rPr>
+          <w:rFonts w:ascii="Times New Roman" w:hAnsi="Times New Roman" w:cs="Times New Roman"/>
+          <w:color w:val="993300"/>
+          <w:kern w:val="0"/>
+          <w:highlight w:val="white"/>
+        </w:rPr>
+        <w:t>"</w:t>
+      </w:r>
+      <w:proofErr w:type="spellStart"/>
+      <w:r>
+        <w:rPr>
+          <w:rFonts w:ascii="Times New Roman" w:hAnsi="Times New Roman" w:cs="Times New Roman"/>
+          <w:color w:val="993300"/>
+          <w:kern w:val="0"/>
+          <w:highlight w:val="white"/>
+        </w:rPr>
+        <w:t>akaS</w:t>
+      </w:r>
+      <w:proofErr w:type="spellEnd"/>
+      <w:r>
+        <w:rPr>
+          <w:rFonts w:ascii="Times New Roman" w:hAnsi="Times New Roman" w:cs="Times New Roman"/>
+          <w:color w:val="993300"/>
+          <w:kern w:val="0"/>
+          <w:highlight w:val="white"/>
+        </w:rPr>
+        <w:t>"</w:t>
+      </w:r>
+      <w:r>
+        <w:rPr>
+          <w:rFonts w:ascii="Times New Roman" w:hAnsi="Times New Roman" w:cs="Times New Roman"/>
+          <w:color w:val="000096"/>
+          <w:kern w:val="0"/>
+          <w:highlight w:val="white"/>
+        </w:rPr>
+        <w:t>&gt;</w:t>
+      </w:r>
+      <w:r>
+        <w:rPr>
+          <w:rFonts w:ascii="Times New Roman" w:hAnsi="Times New Roman" w:cs="Times New Roman"/>
+          <w:color w:val="000000"/>
+          <w:kern w:val="0"/>
+          <w:highlight w:val="white"/>
+        </w:rPr>
+        <w:t xml:space="preserve">de la </w:t>
+      </w:r>
+      <w:proofErr w:type="spellStart"/>
+      <w:r>
+        <w:rPr>
+          <w:rFonts w:ascii="Times New Roman" w:hAnsi="Times New Roman" w:cs="Times New Roman"/>
+          <w:color w:val="000000"/>
+          <w:kern w:val="0"/>
+          <w:highlight w:val="white"/>
+        </w:rPr>
+        <w:t>Pigueliere</w:t>
+      </w:r>
+      <w:proofErr w:type="spellEnd"/>
+      <w:r>
+        <w:rPr>
+          <w:rFonts w:ascii="Times New Roman" w:hAnsi="Times New Roman" w:cs="Times New Roman"/>
+          <w:color w:val="000096"/>
+          <w:kern w:val="0"/>
+          <w:highlight w:val="white"/>
+        </w:rPr>
+        <w:t>&lt;/</w:t>
+      </w:r>
+      <w:proofErr w:type="spellStart"/>
+      <w:r>
+        <w:rPr>
+          <w:rFonts w:ascii="Times New Roman" w:hAnsi="Times New Roman" w:cs="Times New Roman"/>
+          <w:color w:val="000096"/>
+          <w:kern w:val="0"/>
+          <w:highlight w:val="white"/>
+        </w:rPr>
+        <w:t>addName</w:t>
+      </w:r>
+      <w:proofErr w:type="spellEnd"/>
+      <w:r>
+        <w:rPr>
+          <w:rFonts w:ascii="Times New Roman" w:hAnsi="Times New Roman" w:cs="Times New Roman"/>
+          <w:color w:val="000096"/>
+          <w:kern w:val="0"/>
+          <w:highlight w:val="white"/>
+        </w:rPr>
+        <w:t>&gt;</w:t>
+      </w:r>
+    </w:p>
+    <w:p>
+      <w:pPr>
+        <w:shd w:val="clear" w:color="auto" w:fill="FFFFFF"/>
+        <w:autoSpaceDE w:val="0"/>
+        <w:autoSpaceDN w:val="0"/>
+        <w:adjustRightInd w:val="0"/>
+        <w:rPr>
+          <w:rFonts w:ascii="Times New Roman" w:hAnsi="Times New Roman" w:cs="Times New Roman"/>
+          <w:color w:val="000096"/>
+          <w:kern w:val="0"/>
+          <w:highlight w:val="white"/>
+        </w:rPr>
+      </w:pPr>
+      <w:r>
+        <w:rPr>
+          <w:rFonts w:ascii="Times New Roman" w:hAnsi="Times New Roman" w:cs="Times New Roman"/>
+          <w:color w:val="000096"/>
+          <w:kern w:val="0"/>
+          <w:highlight w:val="white"/>
+        </w:rPr>
+        <w:t>&lt;surname</w:t>
+      </w:r>
+      <w:r>
+        <w:rPr>
+          <w:rFonts w:ascii="Times New Roman" w:hAnsi="Times New Roman" w:cs="Times New Roman"/>
+          <w:color w:val="F5844C"/>
+          <w:kern w:val="0"/>
+          <w:highlight w:val="white"/>
+        </w:rPr>
+        <w:t xml:space="preserve"> type</w:t>
+      </w:r>
+      <w:r>
+        <w:rPr>
+          <w:rFonts w:ascii="Times New Roman" w:hAnsi="Times New Roman" w:cs="Times New Roman"/>
+          <w:color w:val="FF8040"/>
+          <w:kern w:val="0"/>
+          <w:highlight w:val="white"/>
+        </w:rPr>
+        <w:t>=</w:t>
+      </w:r>
+      <w:r>
+        <w:rPr>
+          <w:rFonts w:ascii="Times New Roman" w:hAnsi="Times New Roman" w:cs="Times New Roman"/>
+          <w:color w:val="993300"/>
+          <w:kern w:val="0"/>
+          <w:highlight w:val="white"/>
+        </w:rPr>
+        <w:t>"birth"</w:t>
+      </w:r>
+      <w:r>
+        <w:rPr>
+          <w:rFonts w:ascii="Times New Roman" w:hAnsi="Times New Roman" w:cs="Times New Roman"/>
+          <w:color w:val="000096"/>
+          <w:kern w:val="0"/>
+          <w:highlight w:val="white"/>
+        </w:rPr>
+        <w:t>&gt;</w:t>
+      </w:r>
+      <w:r>
+        <w:rPr>
+          <w:rFonts w:ascii="Times New Roman" w:hAnsi="Times New Roman" w:cs="Times New Roman"/>
+          <w:color w:val="000000"/>
+          <w:kern w:val="0"/>
+          <w:highlight w:val="white"/>
+        </w:rPr>
+        <w:t>Holmes</w:t>
+      </w:r>
+      <w:r>
+        <w:rPr>
+          <w:rFonts w:ascii="Times New Roman" w:hAnsi="Times New Roman" w:cs="Times New Roman"/>
+          <w:color w:val="000096"/>
+          <w:kern w:val="0"/>
+          <w:highlight w:val="white"/>
+        </w:rPr>
+        <w:t>&lt;/surname&gt;</w:t>
+      </w:r>
+    </w:p>
+    <w:p>
+      <w:pPr>
+        <w:shd w:val="clear" w:color="auto" w:fill="FFFFFF"/>
+        <w:autoSpaceDE w:val="0"/>
+        <w:autoSpaceDN w:val="0"/>
+        <w:adjustRightInd w:val="0"/>
+        <w:rPr>
+          <w:rFonts w:ascii="Times New Roman" w:hAnsi="Times New Roman" w:cs="Times New Roman"/>
+          <w:color w:val="000096"/>
+          <w:kern w:val="0"/>
+          <w:highlight w:val="white"/>
+        </w:rPr>
+      </w:pPr>
+      <w:r>
+        <w:rPr>
+          <w:rFonts w:ascii="Times New Roman" w:hAnsi="Times New Roman" w:cs="Times New Roman"/>
+          <w:color w:val="000096"/>
+          <w:kern w:val="0"/>
+          <w:highlight w:val="white"/>
+        </w:rPr>
+        <w:t>&lt;surname</w:t>
+      </w:r>
+      <w:r>
+        <w:rPr>
+          <w:rFonts w:ascii="Times New Roman" w:hAnsi="Times New Roman" w:cs="Times New Roman"/>
+          <w:color w:val="F5844C"/>
+          <w:kern w:val="0"/>
+          <w:highlight w:val="white"/>
+        </w:rPr>
+        <w:t xml:space="preserve"> type</w:t>
+      </w:r>
+      <w:r>
+        <w:rPr>
+          <w:rFonts w:ascii="Times New Roman" w:hAnsi="Times New Roman" w:cs="Times New Roman"/>
+          <w:color w:val="FF8040"/>
+          <w:kern w:val="0"/>
+          <w:highlight w:val="white"/>
+        </w:rPr>
+        <w:t>=</w:t>
+      </w:r>
+      <w:r>
+        <w:rPr>
+          <w:rFonts w:ascii="Times New Roman" w:hAnsi="Times New Roman" w:cs="Times New Roman"/>
+          <w:color w:val="993300"/>
+          <w:kern w:val="0"/>
+          <w:highlight w:val="white"/>
+        </w:rPr>
+        <w:t>"married"</w:t>
+      </w:r>
+      <w:r>
+        <w:rPr>
+          <w:rFonts w:ascii="Times New Roman" w:hAnsi="Times New Roman" w:cs="Times New Roman"/>
+          <w:color w:val="000096"/>
+          <w:kern w:val="0"/>
+          <w:highlight w:val="white"/>
+        </w:rPr>
+        <w:t>&gt;</w:t>
+      </w:r>
+      <w:proofErr w:type="spellStart"/>
+      <w:r>
+        <w:rPr>
+          <w:rFonts w:ascii="Times New Roman" w:hAnsi="Times New Roman" w:cs="Times New Roman"/>
+          <w:color w:val="000000"/>
+          <w:kern w:val="0"/>
+          <w:highlight w:val="white"/>
+        </w:rPr>
+        <w:t>Attersoll</w:t>
+      </w:r>
+      <w:proofErr w:type="spellEnd"/>
+      <w:r>
+        <w:rPr>
+          <w:rFonts w:ascii="Times New Roman" w:hAnsi="Times New Roman" w:cs="Times New Roman"/>
+          <w:color w:val="000096"/>
+          <w:kern w:val="0"/>
+          <w:highlight w:val="white"/>
+        </w:rPr>
+        <w:t>&lt;/surname&gt;</w:t>
+      </w:r>
+    </w:p>
+    <w:p>
+      <w:pPr>
+        <w:shd w:val="clear" w:color="auto" w:fill="FFFFFF"/>
+        <w:autoSpaceDE w:val="0"/>
+        <w:autoSpaceDN w:val="0"/>
+        <w:adjustRightInd w:val="0"/>
+        <w:rPr>
+          <w:rFonts w:ascii="Times New Roman" w:hAnsi="Times New Roman" w:cs="Times New Roman"/>
+          <w:kern w:val="0"/>
+          <w:highlight w:val="white"/>
+        </w:rPr>
+      </w:pPr>
+      <w:r>
+        <w:rPr>
+          <w:rFonts w:ascii="Times New Roman" w:hAnsi="Times New Roman" w:cs="Times New Roman"/>
+          <w:color w:val="000096"/>
+          <w:kern w:val="0"/>
+          <w:highlight w:val="white"/>
+        </w:rPr>
+        <w:t>&lt;/</w:t>
+      </w:r>
+      <w:proofErr w:type="spellStart"/>
+      <w:r>
+        <w:rPr>
+          <w:rFonts w:ascii="Times New Roman" w:hAnsi="Times New Roman" w:cs="Times New Roman"/>
+          <w:color w:val="000096"/>
+          <w:kern w:val="0"/>
+          <w:highlight w:val="white"/>
+        </w:rPr>
+        <w:t>persName</w:t>
+      </w:r>
+      <w:proofErr w:type="spellEnd"/>
+    </w:p>
+    <w:p/>
+    <w:p>
+      <w:r>
+        <w:t xml:space="preserve">forename </w:t>
+      </w:r>
+      <w:r>
+        <w:t xml:space="preserve">attributes: </w:t>
+      </w:r>
+      <w:r>
+        <w:t>none or type = grp</w:t>
+      </w:r>
+    </w:p>
+    <w:p>
+      <w:pPr>
+        <w:shd w:val="clear" w:color="auto" w:fill="FFFFFF"/>
+        <w:autoSpaceDE w:val="0"/>
+        <w:autoSpaceDN w:val="0"/>
+        <w:adjustRightInd w:val="0"/>
+        <w:rPr>
+          <w:rFonts w:ascii="Times New Roman" w:hAnsi="Times New Roman" w:cs="Times New Roman"/>
           <w:kern w:val="0"/>
           <w:highlight w:val="white"/>
         </w:rPr>
@@ -1393,22 +2177,120 @@
     </w:p>
     <w:p/>
     <w:p>
+      <w:pPr>
+        <w:shd w:val="clear" w:color="auto" w:fill="FFFFFF"/>
+        <w:autoSpaceDE w:val="0"/>
+        <w:autoSpaceDN w:val="0"/>
+        <w:adjustRightInd w:val="0"/>
+        <w:rPr>
+          <w:rFonts w:ascii="Times New Roman" w:hAnsi="Times New Roman" w:cs="Times New Roman"/>
+          <w:kern w:val="0"/>
+          <w:highlight w:val="white"/>
+        </w:rPr>
+      </w:pPr>
       <w:r>
         <w:t>There are most often multiple forenames inside the one tag; legal forenames that the person didn't use are in parentheses before or after the used name in the one forename tag.</w:t>
       </w:r>
-    </w:p>
-    <w:p>
-      <w:r>
-        <w:t xml:space="preserve">              </w:t>
-      </w:r>
-      <w:r>
-        <w:tab/>
-      </w:r>
-      <w:r>
-        <w:tab/>
-      </w:r>
-      <w:r>
-        <w:t>&lt;surname&gt;Abella&lt;/surname&gt;</w:t>
+      <w:r>
+        <w:t xml:space="preserve"> </w:t>
+      </w:r>
+      <w:proofErr w:type="gramStart"/>
+      <w:r>
+        <w:t xml:space="preserve">Eg </w:t>
+      </w:r>
+      <w:r>
+        <w:rPr>
+          <w:rFonts w:ascii="Times New Roman" w:hAnsi="Times New Roman" w:cs="Times New Roman"/>
+          <w:color w:val="000096"/>
+          <w:kern w:val="0"/>
+          <w:highlight w:val="white"/>
+        </w:rPr>
+        <w:t xml:space="preserve"> &lt;</w:t>
+      </w:r>
+      <w:proofErr w:type="gramEnd"/>
+      <w:r>
+        <w:rPr>
+          <w:rFonts w:ascii="Times New Roman" w:hAnsi="Times New Roman" w:cs="Times New Roman"/>
+          <w:color w:val="000096"/>
+          <w:kern w:val="0"/>
+          <w:highlight w:val="white"/>
+        </w:rPr>
+        <w:t>forename&gt;</w:t>
+      </w:r>
+      <w:r>
+        <w:rPr>
+          <w:rFonts w:ascii="Times New Roman" w:hAnsi="Times New Roman" w:cs="Times New Roman"/>
+          <w:color w:val="000000"/>
+          <w:kern w:val="0"/>
+          <w:highlight w:val="white"/>
+        </w:rPr>
+        <w:t>(Samuel)</w:t>
+      </w:r>
+      <w:r>
+        <w:rPr>
+          <w:rFonts w:ascii="Times New Roman" w:hAnsi="Times New Roman" w:cs="Times New Roman"/>
+          <w:color w:val="000000"/>
+          <w:kern w:val="0"/>
+          <w:highlight w:val="white"/>
+        </w:rPr>
+        <w:t xml:space="preserve"> </w:t>
+      </w:r>
+      <w:r>
+        <w:rPr>
+          <w:rFonts w:ascii="Times New Roman" w:hAnsi="Times New Roman" w:cs="Times New Roman"/>
+          <w:color w:val="000000"/>
+          <w:kern w:val="0"/>
+          <w:highlight w:val="white"/>
+        </w:rPr>
+        <w:t>Egerton</w:t>
+      </w:r>
+      <w:r>
+        <w:rPr>
+          <w:rFonts w:ascii="Times New Roman" w:hAnsi="Times New Roman" w:cs="Times New Roman"/>
+          <w:color w:val="000096"/>
+          <w:kern w:val="0"/>
+          <w:highlight w:val="white"/>
+        </w:rPr>
+        <w:t>&lt;/forename&gt;&lt;surname&gt;</w:t>
+      </w:r>
+      <w:r>
+        <w:rPr>
+          <w:rFonts w:ascii="Times New Roman" w:hAnsi="Times New Roman" w:cs="Times New Roman"/>
+          <w:color w:val="000000"/>
+          <w:kern w:val="0"/>
+          <w:highlight w:val="white"/>
+        </w:rPr>
+        <w:t>Brydges</w:t>
+      </w:r>
+      <w:r>
+        <w:rPr>
+          <w:rFonts w:ascii="Times New Roman" w:hAnsi="Times New Roman" w:cs="Times New Roman"/>
+          <w:color w:val="000096"/>
+          <w:kern w:val="0"/>
+          <w:highlight w:val="white"/>
+        </w:rPr>
+        <w:t>&lt;/surname</w:t>
+      </w:r>
+      <w:r>
+        <w:rPr>
+          <w:rFonts w:ascii="Times New Roman" w:hAnsi="Times New Roman" w:cs="Times New Roman"/>
+          <w:color w:val="000096"/>
+          <w:kern w:val="0"/>
+          <w:highlight w:val="white"/>
+        </w:rPr>
+        <w:t>&gt;</w:t>
+      </w:r>
+    </w:p>
+    <w:p/>
+    <w:p/>
+    <w:p>
+      <w:r>
+        <w:t>Continuing with the Abella example:</w:t>
+      </w:r>
+    </w:p>
+    <w:p>
+      <w:r>
+        <w:t xml:space="preserve">              &lt;surname&gt;Abella&lt;/surname&gt;</w:t>
       </w:r>
     </w:p>
     <w:p>
@@ -1670,7 +2552,6 @@
     <w:p/>
     <w:p>
       <w:r>
-        <w:lastRenderedPageBreak/>
         <w:t>Other notes: when someone is known as multiple names, use additional surnames with types ("married", "birth", "grp", "dynasty"</w:t>
       </w:r>
     </w:p>
@@ -2305,11 +3186,7 @@
         <w:t xml:space="preserve"> ignores the note numbers that you give notes manually. </w:t>
       </w:r>
       <w:r>
-        <w:t xml:space="preserve">Leaving notes unnumbered also allows moving them if </w:t>
-      </w:r>
-      <w:r>
-        <w:lastRenderedPageBreak/>
-        <w:t xml:space="preserve">need </w:t>
+        <w:t xml:space="preserve">Leaving notes unnumbered also allows moving them if need </w:t>
       </w:r>
       <w:proofErr w:type="gramStart"/>
       <w:r>
@@ -3162,6 +4039,7 @@
   <w:style w:type="character" w:default="1" w:styleId="DefaultParagraphFont">
     <w:name w:val="Default Paragraph Font"/>
     <w:uiPriority w:val="1"/>
+    <w:semiHidden/>
     <w:unhideWhenUsed/>
   </w:style>
   <w:style w:type="table" w:default="1" w:styleId="TableNormal">

</xml_diff>